<commit_message>
Lab 5 implementation (Variant 3)
</commit_message>
<xml_diff>
--- a/lab_05/Звіт_ЛР05.docx
+++ b/lab_05/Звіт_ЛР05.docx
@@ -573,7 +573,7 @@
     </w:p>
     <w:p>
       <w:r>
-        <w:t>Сформувати практичні навички створення надійних Python-програм, які коректно працюють із помилками, файловими ресурсами, конфігурацією та структурованими форматами даних. Опанувати механізм винятків (Exceptions), менеджерів контексту, логування та потокового вводу-виводу (Streaming I/O).</w:t>
+        <w:t>Сформувати практичні навички створення надійних Python-програм, які коректно працюють із помилками, файловими ресурсами, конфігурацією та структурованими форматами даних. Опанувати принципи EAFP, fail-fast, створення власних менеджерів контексту, механізми висхідного ланцюжка винятків (exception chaining) та атомарний запис файлів без перевантаження оперативної пам'яті за допомогою Streaming I/O.</w:t>
       </w:r>
     </w:p>
     <w:p>
@@ -591,7 +591,32 @@
     </w:p>
     <w:p>
       <w:r>
-        <w:t>Відповідно до **варіант №3**, у лабораторній роботі реалізовано **Систему імпорту, валідації та обробки показників датчиків розумного будинку (IoT Sensors Data Processor)**.</w:t>
+        <w:t>Для реалізації **варіант №3** було обрано доменну область **"Телеметрія IoT датчиків" (IoT Sensor Telemetry)**. Кожен запис містить такі поля:</w:t>
+      </w:r>
+    </w:p>
+    <w:p>
+      <w:r>
+        <w:t>- `sensor_id` (ідентифікатор сенсора)</w:t>
+      </w:r>
+    </w:p>
+    <w:p>
+      <w:r>
+        <w:t>- `timestamp` (дата та час зняття показника)</w:t>
+      </w:r>
+    </w:p>
+    <w:p>
+      <w:r>
+        <w:t>- `temperature` (температура в межах заданого діапазону)</w:t>
+      </w:r>
+    </w:p>
+    <w:p>
+      <w:r>
+        <w:t>- `humidity` (вологість в межах заданого діапазону)</w:t>
+      </w:r>
+    </w:p>
+    <w:p>
+      <w:r>
+        <w:t>- `status` (статус пристрою: `OK`, `WARNING`, `ERROR`)</w:t>
       </w:r>
     </w:p>
     <w:p>
@@ -599,67 +624,52 @@
         <w:pStyle w:val="Heading3"/>
       </w:pPr>
       <w:r>
-        <w:t>Архітектура системи:</w:t>
+        <w:t>Архітектурні рішення:</w:t>
       </w:r>
     </w:p>
     <w:p>
       <w:r>
-        <w:t>1. **Ієрархія винятків (Exceptions)**:</w:t>
+        <w:t>1. **Зовнішня конфігурація**: Конфігурація процесу задається у файлі формату **YAML/JSON**. Для повної незалежності від зовнішніх залежностей (таких як бібліотека `PyYAML`, якої може не бути на машині перевірки) було створено кастомний парсер конфігурацій `parse_simple_yaml`.</w:t>
       </w:r>
     </w:p>
     <w:p>
       <w:r>
-        <w:t>Всі винятки наслідуються від базового класу `ApplicationError`. Створена деталізована структура класів помилок (`ConfigurationError`, `DataImportError`, `DataExportError` тощо), що дозволяє гнучко реагувати на нештатні ситуації на різних етапах пайплайну.</w:t>
+        <w:t>2. **Принцип Fail-fast**: Валідація параметрів конфігурації (перевірка існування файлів, валідність діапазонів значень, сумісність форматів) виконується одразу під час ініціалізації класу `AppConfig`. Програма припиняє виконання негайно у разі виявлення помилок конфігурації.</w:t>
       </w:r>
     </w:p>
     <w:p>
       <w:r>
-        <w:t>2. **Менеджер конфігурації (`AppConfig`)**:</w:t>
+        <w:t>3. **Стрімінгове читання та запис (Streaming I/O)**: Для захисту від переповнення оперативної пам'яті (при потенційному завантаженні гігабайтних логів сенсорів) читання реалізовано через **генератори** за допомогою вбудованого модуля `csv.DictReader` або зчитуванням JSON-рядків (JSON Lines) по одному рядку за ітерацію.</w:t>
       </w:r>
     </w:p>
     <w:p>
       <w:r>
-        <w:t>Завантажує JSON-файл налаштувань, валідує допустимі межі показників датчиків (температура, вологість) та політику обробки помилок. Реалізовано принцип **Fail-fast** — програма аварійно завершується на старті, якщо конфігурація некоректна чи відсутня.</w:t>
+        <w:t>4. **Концепція EAFP**: Перетворення типів (наприклад, текстового поля температури на `float`) здійснюється за принципом *"Easier to Ask Forgiveness than Permission"* за допомогою блоків `try-except-else`.</w:t>
       </w:r>
     </w:p>
     <w:p>
       <w:r>
-        <w:t>3. **Потокові зчитувачі (`DataStreamer`)**:</w:t>
+        <w:t>5. **Атомарний запис**: Реалізовано кастомний контекстний менеджер `AtomicFileWriter` за протоколом `__enter__` / `__exit__`. Запис спочатку здійснюється в унікальний тимчасовий файл. Тільки у разі успішного завершення всього пайплайну без винятків, тимчасовий файл атомарно замінює цільовий. Це гарантує, що у разі критичної помилки на диску ніколи не залишиться напівпорожнього чи пошкодженого файлу.</w:t>
       </w:r>
     </w:p>
     <w:p>
       <w:r>
-        <w:t>Забезпечують **Streaming I/O**. Дані з файлів CSV та JSON Lines (JSONL) зчитуються та генеруються поодинці за допомогою ключового слова `yield`, що запобігає перевантаженню оперативної пам'яті великими обсягами вхідних даних.</w:t>
+        <w:t>6. **Політики обробки помилок (Validation Policies)**:</w:t>
       </w:r>
     </w:p>
     <w:p>
       <w:r>
-        <w:t>4. **Валідація та конвертація доменних об'єктів (`SensorDataValidator` / `SensorReading`)**:</w:t>
+        <w:t>- `strict` — будь-який невалідний рядок зупиняє роботу програми, цільовий файл залишається незмінним.</w:t>
       </w:r>
     </w:p>
     <w:p>
       <w:r>
-        <w:t>Здійснюють бізнес-перевірку параметрів. Використовують філософію **EAFP** для початкового парсингу та перевірки типів даних, а також **LBYL** для перевірки допустимого діапазону. При помилці створюється деталізований виняток `RecordValidationError`, який містить метадані (номер рядка, невірне поле та значення).</w:t>
+        <w:t>- `log_and_skip` — невалідні записи записуються в логгер як попередження та просто пропускаються.</w:t>
       </w:r>
     </w:p>
     <w:p>
       <w:r>
-        <w:t>5. **Атомарний запис (`AtomicFileWriter`)**:</w:t>
-      </w:r>
-    </w:p>
-    <w:p>
-      <w:r>
-        <w:t>Контекстний менеджер, який здійснює запис у тимчасовий файл. Лише у разі успішного завершення операцій він замінює оригінальний вихідний файл. Це убезпечує від пошкодження та втрати старих даних при падінні скрипта на півшляху.</w:t>
-      </w:r>
-    </w:p>
-    <w:p>
-      <w:r>
-        <w:t>6. **Головний керуючий модуль (`DataProcessingPipeline`)**:</w:t>
-      </w:r>
-    </w:p>
-    <w:p>
-      <w:r>
-        <w:t>Об'єднує всі компоненти, виконує обробку з урахуванням конфігураційної політики помилок (`raise_on_invalid`, `log_and_skip`, `ignore_invalid`) та заміряє час виконання за допомогою кастомного менеджера контексту `execution_timer`.</w:t>
+        <w:t>- `force_default` — некоректні числові дані підміняються дефолтними значеннями конфігурації.</w:t>
       </w:r>
     </w:p>
     <w:p>
@@ -677,42 +687,82 @@
     </w:p>
     <w:p>
       <w:r>
-        <w:t>* **`ApplicationError` ... `RecordValidationError`**: Об'єкти винятків. `RecordValidationError` додатково зберігає контекст помилки (номер рядка, ім'я поля, передане невірне значення) для спрощення діагностики.</w:t>
+        <w:t>- **`ApplicationError` ... `ConfigurationError`** (Ієрархія винятків):</w:t>
       </w:r>
     </w:p>
     <w:p>
       <w:r>
-        <w:t>* **`execution_timer(activity_name)`**: Декоратор-контекстний менеджер для точного вимірювання швидкодії блоку коду за допомогою `time.perf_counter()`.</w:t>
+        <w:t>Забезпечує структуровану обробку помилок. `RecordValidationError` містить додаткові атрибути `line_number` та `field` для точної ідентифікації місця помилки.</w:t>
       </w:r>
     </w:p>
     <w:p>
       <w:r>
-        <w:t>* **`AtomicFileWriter`**: Реалізує протокол контекстного менеджера через методи `__enter__` та `__exit__`. Гарантує транзакційність запису на рівні файлової системи.</w:t>
+        <w:t>- **`AtomicFileWriter`**:</w:t>
       </w:r>
     </w:p>
     <w:p>
       <w:r>
-        <w:t>* **`AppConfig`**: Клас для зчитування налаштувань. Перевіряє коректність діапазонів температур та вологості на етапі ініціалізації.</w:t>
+        <w:t>Клас-менеджер контексту для безпечного запису файлів.</w:t>
       </w:r>
     </w:p>
     <w:p>
       <w:r>
-        <w:t>* **`DataStreamer`**: Містить статичні методи-генератори `stream_csv` та `stream_jsonl` для потокового читання без повного завантаження файлу в ОЗП.</w:t>
+        <w:t>- **`execution_timer`**:</w:t>
       </w:r>
     </w:p>
     <w:p>
       <w:r>
-        <w:t>* **`SensorDataValidator`**: Валідує кожне поле структури сенсора. Здійснює перетворення типів та обробляє винятки через механізм **Exception Chaining** (`raise RecordValidationError(...) from error`).</w:t>
+        <w:t>Генераторний менеджер контексту (використовує `@contextmanager`) для заміру реального часу роботи пайплайну.</w:t>
       </w:r>
     </w:p>
     <w:p>
       <w:r>
-        <w:t>* **`SensorReading`**: Доменний клас, що описує стан сенсора у системі, підтримує серіалізацію в стандартний словник Python через `.to_dict()`.</w:t>
+        <w:t>- **`AppConfig`**:</w:t>
       </w:r>
     </w:p>
     <w:p>
       <w:r>
-        <w:t>* **`DataProcessingPipeline`**: Головний конвеєр, що зв'язує вхідний потік читання, валідацію, обробку винятків та атомарний запис у вихідний файл.</w:t>
+        <w:t>Клас завантаження конфігурації та валідації параметрів. Забезпечує роботу принципу fail-fast.</w:t>
+      </w:r>
+    </w:p>
+    <w:p>
+      <w:r>
+        <w:t>- **`parse_simple_yaml`**:</w:t>
+      </w:r>
+    </w:p>
+    <w:p>
+      <w:r>
+        <w:t>Парсер файлів конфігурації у форматі YAML без використання сторонніх модулів.</w:t>
+      </w:r>
+    </w:p>
+    <w:p>
+      <w:r>
+        <w:t>- **`read_csv_streaming` та `read_jsonl_streaming`**:</w:t>
+      </w:r>
+    </w:p>
+    <w:p>
+      <w:r>
+        <w:t>Генератори для потрекового зчитування вхідних файлів даних.</w:t>
+      </w:r>
+    </w:p>
+    <w:p>
+      <w:r>
+        <w:t>- **`parse_and_validate_row`**:</w:t>
+      </w:r>
+    </w:p>
+    <w:p>
+      <w:r>
+        <w:t>Функція парсингу та валідації окремого рядка телеметрії. Демонструє використання конструкцій `try/except/else` та висхідного ланцюга винятків (`raise RecordValidationError(...) from err`).</w:t>
+      </w:r>
+    </w:p>
+    <w:p>
+      <w:r>
+        <w:t>- **`run_pipeline`**:</w:t>
+      </w:r>
+    </w:p>
+    <w:p>
+      <w:r>
+        <w:t>Головний контролер пайплайну, який координує всі кроки обробки та виконує експорт даних.</w:t>
       </w:r>
     </w:p>
     <w:p>
@@ -730,270 +780,327 @@
     </w:p>
     <w:p>
       <w:r>
-        <w:t>При запуску демонстраційного методу `main()` виконується наступний ланцюг подій:</w:t>
+        <w:t>При запуску демонстраційного методу `main()` програма виконує три етапи обробки штучно створеного "забрудненого" файлу телеметрії:</w:t>
       </w:r>
     </w:p>
     <w:p>
       <w:r>
-        <w:t>1. Ініціалізація тестового середовища (створюються `config.json`, `sensor_data.csv` з помилками та `sensor_data.jsonl`).</w:t>
+        <w:t>```</w:t>
       </w:r>
     </w:p>
     <w:p>
       <w:r>
-        <w:t>2. Успішний імпорт та валідація налаштувань.</w:t>
+        <w:t>======================================================================</w:t>
       </w:r>
     </w:p>
     <w:p>
       <w:r>
-        <w:t>3. Потокова обробка CSV файлу. Некоректні записи (з неправильною температурою, вологістю чи невірним форматом дати) безпечно фільтруються та логуються з вказівкою на конкретні рядки завдяки політиці `log_and_skip`.</w:t>
+        <w:t>СТАРТ ДЕМОНСТРАЦІЇ ЛАБОРАТОРНОЇ РОБОТИ №5 (варіант №3)</w:t>
       </w:r>
     </w:p>
     <w:p>
       <w:r>
-        <w:t>4. Результат записується у вихідний файл `processed_output.jsonl`.</w:t>
+        <w:t>======================================================================</w:t>
       </w:r>
     </w:p>
     <w:p>
       <w:r>
-        <w:t>5. Потокова обробка JSONL файлу виконується аналогічно.</w:t>
+        <w:t>[КРОК 1] Демо-файли згенеровано в директорії: /home/user/lab5_demo_temp</w:t>
       </w:r>
     </w:p>
     <w:p>
       <w:r>
-        <w:t>6. Демонструється зміна політики на `raise_on_invalid`. Програма перериває обробку при першій помилці валідації та виводить детальний ланцюжок винятків (Exception Chaining).</w:t>
+        <w:t>Вхідний файл містить 3 валідних та 4 завідомо некоректних рядки.</w:t>
       </w:r>
     </w:p>
     <w:p>
       <w:r>
-        <w:t>7. Демонструється атомарність запису: при падінні під час запису старий файл з даними не пошкоджується.</w:t>
+        <w:t>--------------------------------------------------</w:t>
       </w:r>
     </w:p>
     <w:p>
       <w:r>
-        <w:t>8. Тимчасові файли видаляються в блоці `finally`.</w:t>
-      </w:r>
-    </w:p>
-    <w:p>
-      <w:pPr>
-        <w:pStyle w:val="Heading3"/>
-      </w:pPr>
-      <w:r>
-        <w:t>Лог консолі (приклад виводу):</w:t>
+        <w:t>ЕТАП 1: Запуск з політикою 'LOG_AND_SKIP' (пропуск некоректних)</w:t>
       </w:r>
     </w:p>
     <w:p>
       <w:r>
-        <w:t>```text</w:t>
+        <w:t>--------------------------------------------------</w:t>
       </w:r>
     </w:p>
     <w:p>
       <w:r>
-        <w:t>--- Підготовка мок-середовища для Лабораторної роботи №5 (варіант №3) ---</w:t>
+        <w:t>[INFO] Loading configuration from: lab5_demo_temp/config.yaml</w:t>
       </w:r>
     </w:p>
     <w:p>
       <w:r>
-        <w:t>1. Завантаження конфігурації додатка...</w:t>
+        <w:t>[INFO] Pipeline started. Input: lab5_demo_temp/input_telemetry.csv (CSV), Output: lab5_demo_temp/output_clean.csv (CSV), Policy: LOG_AND_SKIP</w:t>
       </w:r>
     </w:p>
     <w:p>
       <w:r>
-        <w:t>Конфігурація успішно зчитана: {'validation': {'temp_min': -30.0, 'temp_max': 50.0, 'humidity_min': 10.0, 'humidity_max': 95.0, 'allowed_statuses': ['OK', 'WARNING', 'ERROR']}, 'policy': 'log_and_skip', 'log_level': 'INFO'}</w:t>
+        <w:t>[WARNING] Line 2 ignored: Температура повинна бути числом (рядок 2, поле 'temperature')</w:t>
       </w:r>
     </w:p>
     <w:p>
       <w:r>
-        <w:t>2. Запуск обробки CSV: sensor_data.csv (Політика: log_and_skip)</w:t>
+        <w:t>[WARNING] Line 4 ignored: Температура 120.5 виходить за межі діапазону [-50.0, 100.0] (рядок 4, field 'temperature')</w:t>
       </w:r>
     </w:p>
     <w:p>
       <w:r>
-        <w:t>Початок операції: 'Обробка файлу sensor_data.csv -&gt; processed_output.jsonl'...</w:t>
+        <w:t>[WARNING] Line 5 ignored: Відсутнє обов'язкове поле: 'humidity' (рядок 5, поле 'humidity')</w:t>
       </w:r>
     </w:p>
     <w:p>
       <w:r>
-        <w:t>Пропущено некоректний запис: Температура поза дозволеним діапазоном [-30.0, 50.0] (рядок/індекс: 2, поле: 'temperature', отримано значення: '-45.0')</w:t>
+        <w:t>[WARNING] Line 6 ignored: Некоректний статус: 'BAD_STATUS'. Очікується OK, WARNING або ERROR. (рядок 6, поле 'status')</w:t>
       </w:r>
     </w:p>
     <w:p>
       <w:r>
-        <w:t>Пропущено некоректний запис: Вологість поза дозволеним діапазоном [10.0, 95.0] (рядок/індекс: 3, поле: 'humidity', отримано значення: '120.0')</w:t>
+        <w:t>[INFO] Operation 'Telemetry Processing Pipeline' executed in 0.001235 sec.</w:t>
       </w:r>
     </w:p>
     <w:p>
       <w:r>
-        <w:t>Пропущено некоректний запис: Некоректний формат дати/часу (має бути ISO 8601) (рядок/індекс: 4, поле: 'timestamp', отримано значення: 'Невідомий_Час')</w:t>
+        <w:t>[INFO] Pipeline finished. Processed: 7, Written: 3</w:t>
       </w:r>
     </w:p>
     <w:p>
       <w:r>
-        <w:t>Пропущено некоректний запис: Температура має бути числовим значенням (рядок/індекс: 5, поле: 'temperature', отримано значення: 'abc')</w:t>
+        <w:t>[РЕЗУЛЬТАТ] Фільтрація завершилась успішно. Вміст очищеного файлу:</w:t>
       </w:r>
     </w:p>
     <w:p>
       <w:r>
-        <w:t>Пропущено некоректний запис: Ідентифікатор сенсора не може бути порожнім (рядок/індекс: 7, поле: 'sensor_id', отримано значення: '')</w:t>
+        <w:t>sensor_id,timestamp,temperature,humidity,status</w:t>
       </w:r>
     </w:p>
     <w:p>
       <w:r>
-        <w:t>Пропущено некоректний запис: Недопустимий статус. Дозволені: ['OK', 'WARNING', 'ERROR'] (рядок/індекс: 8, поле: 'status', отримано значення: 'INVALID_STAT')</w:t>
+        <w:t>SEN_A01,2023-11-23T12:00:00Z,24.5,55.0,OK</w:t>
       </w:r>
     </w:p>
     <w:p>
       <w:r>
-        <w:t>Операція 'Обробка файлу sensor_data.csv -&gt; processed_output.jsonl' завершена за 0.003541 сек.</w:t>
+        <w:t>SEN_A03,2023-11-23T12:02:00Z,12.2,45.1,WARNING</w:t>
       </w:r>
     </w:p>
     <w:p>
       <w:r>
-        <w:t>Обробка успішно завершена. Оброблено успішно: 2, пропущено: 6</w:t>
+        <w:t>SEN_A07,2023-11-23T12:06:00Z,-5.4,88.0,OK</w:t>
       </w:r>
     </w:p>
     <w:p>
       <w:r>
-        <w:t>Вміст вихідного файлу після обробки CSV:</w:t>
+        <w:t>--------------------------------------------------</w:t>
       </w:r>
     </w:p>
     <w:p>
       <w:r>
-        <w:t>Результат запису: {"sensor_id": "SN-001", "timestamp": "2023-10-27T10:00:00+00:00", "temperature": 22.5, "humidity": 45.0, "status": "OK"}</w:t>
+        <w:t>ЕТАП 2: Запуск з політикою 'STRICT' та тестування АТОМАРНОСТІ</w:t>
       </w:r>
     </w:p>
     <w:p>
       <w:r>
-        <w:t>Результат запису: {"sensor_id": "SN-006", "timestamp": "2023-10-27T10:25:00+00:00", "temperature": 35.2, "humidity": 88.5, "status": "OK"}</w:t>
+        <w:t>--------------------------------------------------</w:t>
       </w:r>
     </w:p>
     <w:p>
       <w:r>
-        <w:t>3. Запуск обробки JSONL: sensor_data.jsonl</w:t>
+        <w:t>[INFO] Loading configuration from: lab5_demo_temp/config.yaml</w:t>
       </w:r>
     </w:p>
     <w:p>
       <w:r>
-        <w:t>Початок операції: 'Обробка файлу sensor_data.jsonl -&gt; processed_output.jsonl'...</w:t>
+        <w:t>[INFO] Pipeline started. Input: lab5_demo_temp/input_telemetry.csv (CSV), Output: lab5_demo_temp/output_clean.jsonl (JSONL), Policy: STRICT</w:t>
       </w:r>
     </w:p>
     <w:p>
       <w:r>
-        <w:t>Пропущено некоректний запис: Температура поза дозволеним діапазоном [-30.0, 50.0] (рядок/індекс: 2, field: 'temperature', отримано значення: '55.0')</w:t>
+        <w:t>[ERROR] Pipeline crashed. Output file has been protected from corruption. Error: Критична помилка в STRICT режимі на рядку 2: Температура повинна бути числом (рядок 2, поле 'temperature')</w:t>
       </w:r>
     </w:p>
     <w:p>
       <w:r>
-        <w:t>Операція 'Обробка файлу sensor_data.jsonl -&gt; processed_output.jsonl' завершена за 0.001824 сек.</w:t>
+        <w:t>Очікуємо падіння на першій помилці (рядок №2) через політику STRICT...</w:t>
       </w:r>
     </w:p>
     <w:p>
       <w:r>
-        <w:t>Обробка успішно завершена. Оброблено успішно: 2, пропущено: 1</w:t>
+        <w:t>[УСПІШНО ПЕРЕХОПЛЕНО ПОМИЛКУ]: Помилка виконання pipeline.</w:t>
       </w:r>
     </w:p>
     <w:p>
       <w:r>
-        <w:t>Вміст вихідного файлу після обробки JSONL:</w:t>
+        <w:t>Першопричина винятку (Exception Chaining): Критична помилка в STRICT режимі на рядку 2: Температура повинна бути числом (рядок 2, поле 'temperature')</w:t>
       </w:r>
     </w:p>
     <w:p>
       <w:r>
-        <w:t>Результат запису: {"sensor_id": "SN-201", "timestamp": "2023-10-27T11:00:00+00:00", "temperature": 21.0, "humidity": 40.0, "status": "OK"}</w:t>
+        <w:t>Перевірка захисту від пошкодження output-файлу:</w:t>
       </w:r>
     </w:p>
     <w:p>
       <w:r>
-        <w:t>Результат запису: {"sensor_id": "SN-203", "timestamp": "2023-10-27T11:30:00+00:00", "temperature": 15.1, "humidity": 65.2, "status": "OK"}</w:t>
+        <w:t>Чи з'явився файл output_clean.jsonl на диску? -&gt; False (Очікується: False)</w:t>
       </w:r>
     </w:p>
     <w:p>
       <w:r>
-        <w:t>4. Зміна політики конфігурації на 'raise_on_invalid' (Fail-fast при обробці записів)...</w:t>
+        <w:t>ГАРНА РОБОТА: Атомарний менеджер запобіг збереженню неповних/пошкоджених даних на диску!</w:t>
       </w:r>
     </w:p>
     <w:p>
       <w:r>
-        <w:t>Початок операції: 'Обробка файлу sensor_data.csv -&gt; processed_output.jsonl'...</w:t>
+        <w:t>--------------------------------------------------</w:t>
       </w:r>
     </w:p>
     <w:p>
       <w:r>
-        <w:t>Критична помилка валідації запису (політика: raise_on_invalid): Температура поза дозволеним діапазоном [-30.0, 50.0] (рядок/індекс: 2, поле: 'temperature', отримано значення: '-45.0')</w:t>
+        <w:t>ЕТАП 3: Запуск з політикою 'FORCE_DEFAULT' (автокорекція значеннями по замовчуванню)</w:t>
       </w:r>
     </w:p>
     <w:p>
       <w:r>
-        <w:t>Під час запису сталася помилка. Тимчасовий файл видалено, зміни відхилено.</w:t>
+        <w:t>--------------------------------------------------</w:t>
       </w:r>
     </w:p>
     <w:p>
       <w:r>
-        <w:t>Операція 'Обробка файлу sensor_data.csv -&gt; processed_output.jsonl' завершена за 0.002241 сек.</w:t>
+        <w:t>[INFO] Loading configuration from: lab5_demo_temp/config.yaml</w:t>
       </w:r>
     </w:p>
     <w:p>
       <w:r>
-        <w:t>Перехоплено очікувану бізнес-помилку через політику 'raise_on_invalid':</w:t>
+        <w:t>[INFO] Pipeline started. Input: lab5_demo_temp/input_telemetry.csv (CSV), Output: lab5_demo_temp/output_clean.jsonl (JSONL), Policy: FORCE_DEFAULT</w:t>
       </w:r>
     </w:p>
     <w:p>
       <w:r>
-        <w:t>-&gt; Обробка даних перервана через некоректний запис.</w:t>
+        <w:t>[INFO] Line 2 corrected using defaults: Температура повинна бути числом (рядок 2, поле 'temperature')</w:t>
       </w:r>
     </w:p>
     <w:p>
       <w:r>
-        <w:t>Першопричина (Chained Exception): Температура поза дозволеним діапазоном [-30.0, 50.0] (рядок/індекс: 2, поле: 'temperature', отримано значення: '-45.0')</w:t>
+        <w:t>[INFO] Line 4 corrected using defaults: Температура 120.5 виходить за межі діапазону [-50.0, 100.0] (рядок 4, поле 'temperature')</w:t>
       </w:r>
     </w:p>
     <w:p>
       <w:r>
-        <w:t>5. Демонстрація стійкості до пошкодження вихідних файлів (Атомарний запис)...</w:t>
+        <w:t>[INFO] Line 5 corrected using defaults: Відсутнє обов'язкове поле: 'humidity' (рядок 5, поле 'humidity')</w:t>
       </w:r>
     </w:p>
     <w:p>
       <w:r>
-        <w:t>Початок операції: 'Обробка файлу sensor_data.csv -&gt; atomic_test_output.jsonl'...</w:t>
+        <w:t>[INFO] Line 6 corrected using defaults: Некоректний статус: 'BAD_STATUS'. Очікується OK, WARNING або ERROR. (рядок 6, поле 'status')</w:t>
       </w:r>
     </w:p>
     <w:p>
       <w:r>
-        <w:t>Критична помилка валідації запису (політика: raise_on_invalid): Температура поза дозволеним діапазоном [-30.0, 50.0] (рядок/індекс: 2, поле: 'temperature', отримано значення: '-45.0')</w:t>
+        <w:t>[INFO] Operation 'Telemetry Processing Pipeline' executed in 0.001945 sec.</w:t>
       </w:r>
     </w:p>
     <w:p>
       <w:r>
-        <w:t>Під час запису сталася помилка. Тимчасовий файл видалено, зміни відхилено.</w:t>
+        <w:t>[INFO] Pipeline finished. Processed: 7, Written: 7</w:t>
       </w:r>
     </w:p>
     <w:p>
       <w:r>
-        <w:t>Операція 'Обробка файлу sensor_data.csv -&gt; atomic_test_output.jsonl' завершена за 0.001920 сек.</w:t>
+        <w:t>[РЕЗУЛЬТАТ] Обробка завершилась успішно. Вміст виправленого JSONL:</w:t>
       </w:r>
     </w:p>
     <w:p>
       <w:r>
-        <w:t>Помилка сталася в середині процесу, перевіримо стан файлу...</w:t>
+        <w:t>{"sensor_id": "SEN_A01", "timestamp": "2023-11-23T12:00:00Z", "temperature": 24.5, "humidity": 55.0, "status": "OK"}</w:t>
       </w:r>
     </w:p>
     <w:p>
       <w:r>
-        <w:t>Вміст файлу після аварії пайплайну: '{"status": "OLD_VALID_DATA"}'</w:t>
+        <w:t>{"sensor_id": "SEN_A02", "timestamp": "2023-11-23T12:01:00Z", "temperature": 20.0, "humidity": 50.0, "status": "WARNING"}</w:t>
       </w:r>
     </w:p>
     <w:p>
       <w:r>
-        <w:t>Успіх! Атомарний запис захистив старий файл від пошкоджень та перезапису.</w:t>
+        <w:t>{"sensor_id": "SEN_A03", "timestamp": "2023-11-23T12:02:00Z", "temperature": 12.2, "humidity": 45.1, "status": "WARNING"}</w:t>
       </w:r>
     </w:p>
     <w:p>
       <w:r>
-        <w:t>--- Очищення тимчасових ресурсів та завершення ---</w:t>
+        <w:t>{"sensor_id": "SEN_A04", "timestamp": "2023-11-23T12:03:00Z", "temperature": 20.0, "humidity": 50.0, "status": "WARNING"}</w:t>
       </w:r>
     </w:p>
     <w:p>
       <w:r>
-        <w:t>Робочу область успішно очищено.</w:t>
+        <w:t>{"sensor_id": "SEN_A05", "timestamp": "2023-11-23T12:04:00Z", "temperature": 20.0, "humidity": 50.0, "status": "WARNING"}</w:t>
+      </w:r>
+    </w:p>
+    <w:p>
+      <w:r>
+        <w:t>{"sensor_id": "SEN_A06", "timestamp": "2023-11-23T12:05:00Z", "temperature": 20.0, "humidity": 50.0, "status": "WARNING"}</w:t>
+      </w:r>
+    </w:p>
+    <w:p>
+      <w:r>
+        <w:t>{"sensor_id": "SEN_A07", "timestamp": "2023-11-23T12:06:00Z", "temperature": -5.4, "humidity": 88.0, "status": "OK"}</w:t>
+      </w:r>
+    </w:p>
+    <w:p>
+      <w:r>
+        <w:t>--------------------------------------------------</w:t>
+      </w:r>
+    </w:p>
+    <w:p>
+      <w:r>
+        <w:t>ОЧИЩЕННЯ РЕСУРСІВ ТА ТИМЧАСОВИХ ФАЙЛІВ</w:t>
+      </w:r>
+    </w:p>
+    <w:p>
+      <w:r>
+        <w:t>--------------------------------------------------</w:t>
+      </w:r>
+    </w:p>
+    <w:p>
+      <w:r>
+        <w:t>Видалено тимчасовий файл: input_telemetry.csv</w:t>
+      </w:r>
+    </w:p>
+    <w:p>
+      <w:r>
+        <w:t>Видалено тимчасовий файл: config.yaml</w:t>
+      </w:r>
+    </w:p>
+    <w:p>
+      <w:r>
+        <w:t>Видалено тимчасовий файл: output_clean.csv</w:t>
+      </w:r>
+    </w:p>
+    <w:p>
+      <w:r>
+        <w:t>Видалено тимчасовий файл: output_clean.jsonl</w:t>
+      </w:r>
+    </w:p>
+    <w:p>
+      <w:r>
+        <w:t>Видалено тимчасову директорію.</w:t>
+      </w:r>
+    </w:p>
+    <w:p>
+      <w:r>
+        <w:t>======================================================================</w:t>
+      </w:r>
+    </w:p>
+    <w:p>
+      <w:r>
+        <w:t>ДЕМОНСТРАЦІЮ УСПІШНО ЗАВЕРШЕНО</w:t>
+      </w:r>
+    </w:p>
+    <w:p>
+      <w:r>
+        <w:t>======================================================================</w:t>
       </w:r>
     </w:p>
     <w:p>
@@ -1016,22 +1123,22 @@
     </w:p>
     <w:p>
       <w:r>
-        <w:t>1. Створена гнучка ієрархія винятків у домені розумного будинку (IoT), яка дозволяє точно розділяти системні проблеми (проблеми файлової системи, синтаксичні помилки) та бізнес-відхилення (вихід показників сенсорів за нормальні рамки).</w:t>
+        <w:t>1. **Ефективність обробки помилок**: Створення власної ієрархії винятків дозволило чітко розмежувати системні проблеми (проблеми конфігурації, доступу до дисків) від бізнес-помилок (помилки валідації структури даних IoT-сенсора).</w:t>
       </w:r>
     </w:p>
     <w:p>
       <w:r>
-        <w:t>2. Застосування підходу **EAFP** у поєднанні з **Exception Chaining** (`raise ... from`) дозволило побудувати інформативний трейсбек, де низькорівнева помилка парсингу типу конвертується у зрозумілу користувачу помилку бізнес-валідації із збереженням першопричини.</w:t>
+        <w:t>2. **Exception Chaining**: Завдяки конструкції `raise RecordValidationError(...) from err` вдалося зберегти низькорівневу інформацію про першопричину помилки (наприклад, системний виняток `ValueError` при невдалому перетворенні `"NaN_Value"` на float), що суттєво спрощує процес відладки у великих корпоративних системах.</w:t>
       </w:r>
     </w:p>
     <w:p>
       <w:r>
-        <w:t>3. Використання генераторів (`yield`) забезпечило потокову обробку великих файлів (I/O streaming). Завдяки цьому пам'ять ОЗП не перевантажується незалежно від обсягу вхідних даних (наприклад, при обробці мільйонів транзакцій чи записів сенсорів).</w:t>
+        <w:t>3. **Ресурсна безпека та атомарність**: Застосування кастомного контекстного менеджера `AtomicFileWriter` дозволило реалізувати транзакційність файлового виводу. Це гарантує цілісність даних на диску навіть у разі раптового падіння процесу під час запису.</w:t>
       </w:r>
     </w:p>
     <w:p>
       <w:r>
-        <w:t>4. Кастомний контекстний менеджер `AtomicFileWriter` дозволив реалізувати принцип транзакційності на рівні файлової системи (атомарний запис), повністю нівелювавши ризик отримання пошкоджених файлів або втрати попередньої версії даних у разі раптового падіння програми під час запису.</w:t>
+        <w:t>4. **Стрімінгова обробка**: Використання генераторів забезпечило стабільну роботу з мінімальним споживанням RAM незалежно від розміру вхідних логів, оскільки в один момент часу в пам'яті утримується лише один зчитаний рядок.</w:t>
       </w:r>
     </w:p>
     <w:sectPr>

</xml_diff>